<commit_message>
Store the project notes alongside the code
These lived only on one machine: the changelog, the spec for the four
extraction changes, and newer versions of the instructions, the product
spec, the PRD and the two Phase 3 notes.

The README's file list also had nothing about the app, its source, or the
two test harnesses, so anyone opening the repository could not tell that
brsr-app.html is generated and must not be edited directly.

Not included, deliberately: brsrapp.html and brsrapp2.html, which are
copies of the built app rather than sources — 4 MB of duplicate generated
output, rebuilt any time by tools/build_app.py. Nor the sample BRSR PDF,
which is a real company's filing and nobody has decided it belongs here.

Co-Authored-By: Claude Opus 5 <noreply@anthropic.com>
</commit_message>
<xml_diff>
--- a/ESG-Profile-Platform-PRD.docx
+++ b/ESG-Profile-Platform-PRD.docx
@@ -63,7 +63,7 @@
           <w:color w:val="1A1A1A"/>
           <w:sz w:val="19"/>
         </w:rPr>
-        <w:t>3.0</w:t>
+        <w:t>5.0</w:t>
       </w:r>
     </w:p>
     <w:p>
@@ -83,7 +83,7 @@
           <w:color w:val="1A1A1A"/>
           <w:sz w:val="19"/>
         </w:rPr>
-        <w:t>7 September 2026</w:t>
+        <w:t>9 September 2026</w:t>
       </w:r>
     </w:p>
     <w:p>
@@ -103,7 +103,7 @@
           <w:color w:val="1A1A1A"/>
           <w:sz w:val="19"/>
         </w:rPr>
-        <w:t>Phase 1 built and demonstrated; Phases 2-4 for discussion</w:t>
+        <w:t>Phase 1 built; Phase 3 prototype working with a known defect</w:t>
       </w:r>
     </w:p>
     <w:p>
@@ -143,7 +143,7 @@
           <w:color w:val="1A1A1A"/>
           <w:sz w:val="19"/>
         </w:rPr>
-        <w:t>product-spec.md (Phase 1 build specification), CLAUDE.md</w:t>
+        <w:t>product-spec.md, CHANGELOG.md, phase3-spike-brief.md</w:t>
       </w:r>
     </w:p>
     <w:p>
@@ -218,6 +218,20 @@
           <w:sz w:val="21"/>
         </w:rPr>
         <w:t>This document sets out the vision and a four-phase roadmap. Phase 1 — a single-company profile viewer — is built and has been demonstrated in a browser: 663 real disclosures, filtering by theme, keyword and reporting framework, trend charts, and export, with no server and no dependencies. Every disclosure now also carries its BRSR indicator number and the GRI disclosures it maps to, each traceable to a published source. Phases 2 to 4 extend to multiple companies, assisted extraction directly from a published report, and peer benchmarking.</w:t>
+        <w:br/>
+      </w:r>
+    </w:p>
+    <w:p>
+      <w:pPr>
+        <w:spacing w:after="160"/>
+      </w:pPr>
+      <w:r>
+        <w:rPr>
+          <w:i w:val="0"/>
+          <w:color w:val="1A1A1A"/>
+          <w:sz w:val="21"/>
+        </w:rPr>
+        <w:t>Phase 3 — the original idea, in which a company's report is turned into a profile without manual keying — now has a working prototype. It reads a filed report entirely in the browser with no AI model, no network and therefore no cost per report, and it will not let a profile be generated until a human has approved or excluded every indicator. What it has not yet had is a measurement: nobody has run it against a report whose correct answers are known. That single number decides whether a client can check their own profile or whether every one must pass through the consultant, and with it the economics of the whole product.</w:t>
       </w:r>
     </w:p>
     <w:p>
@@ -1736,7 +1750,7 @@
                 <w:color w:val="1A1A1A"/>
                 <w:sz w:val="19"/>
               </w:rPr>
-              <w:t>Proposed — the original idea, and the hardest</w:t>
+              <w:t>PROTOTYPE BUILT; accuracy unmeasured</w:t>
             </w:r>
           </w:p>
         </w:tc>
@@ -1866,6 +1880,7 @@
           <w:sz w:val="21"/>
         </w:rPr>
         <w:t>Phase 3 therefore produces a reviewable draft: proposed rows, each with the page it was drawn from, presented for approval. That keeps a qualified human between extraction and publication, which is also what makes the output defensible to the company's auditors and to the consultant's own professional standing. The time saved is still most of the work.</w:t>
+        <w:br/>
       </w:r>
     </w:p>
     <w:p>
@@ -2262,6 +2277,527 @@
           <w:sz w:val="21"/>
         </w:rPr>
         <w:t>This matters commercially as well as intellectually. A consultant may be asked to defend any row's classification to a client. A mapping traceable to a named public document can be defended; a keyword guess cannot.</w:t>
+      </w:r>
+    </w:p>
+    <w:p>
+      <w:pPr>
+        <w:keepNext/>
+        <w:spacing w:before="240" w:after="60"/>
+      </w:pPr>
+      <w:r>
+        <w:rPr>
+          <w:b/>
+          <w:color w:val="1A1A1A"/>
+          <w:sz w:val="23"/>
+        </w:rPr>
+        <w:t>Phase 3 prototype — what it settles, and what it does not</w:t>
+      </w:r>
+    </w:p>
+    <w:p>
+      <w:pPr>
+        <w:spacing w:after="160"/>
+      </w:pPr>
+      <w:r>
+        <w:rPr>
+          <w:i w:val="0"/>
+          <w:color w:val="1A1A1A"/>
+          <w:sz w:val="21"/>
+        </w:rPr>
+        <w:t>A working prototype now reads a filed BRSR or sustainability report and produces a profile. It runs entirely in the browser: no server, no install, no internet connection.</w:t>
+      </w:r>
+    </w:p>
+    <w:p>
+      <w:pPr>
+        <w:spacing w:after="160"/>
+      </w:pPr>
+      <w:r>
+        <w:rPr>
+          <w:i w:val="0"/>
+          <w:color w:val="1A1A1A"/>
+          <w:sz w:val="21"/>
+        </w:rPr>
+        <w:t>Three questions this document previously left open are now answered:</w:t>
+      </w:r>
+    </w:p>
+    <w:p>
+      <w:pPr>
+        <w:pStyle w:val="ListBullet"/>
+        <w:spacing w:after="80"/>
+        <w:ind w:left="340"/>
+      </w:pPr>
+      <w:r>
+        <w:rPr>
+          <w:b/>
+          <w:color w:val="1A1A1A"/>
+          <w:sz w:val="21"/>
+        </w:rPr>
+        <w:t xml:space="preserve">Cost per report:  </w:t>
+      </w:r>
+      <w:r>
+        <w:rPr>
+          <w:color w:val="1A1A1A"/>
+          <w:sz w:val="21"/>
+        </w:rPr>
+        <w:t>there is none. Extraction is pattern and layout analysis rather than an AI model, so a report costs nothing to process and the unit economics stop being a risk to the pricing.</w:t>
+      </w:r>
+    </w:p>
+    <w:p>
+      <w:pPr>
+        <w:pStyle w:val="ListBullet"/>
+        <w:spacing w:after="80"/>
+        <w:ind w:left="340"/>
+      </w:pPr>
+      <w:r>
+        <w:rPr>
+          <w:b/>
+          <w:color w:val="1A1A1A"/>
+          <w:sz w:val="21"/>
+        </w:rPr>
+        <w:t xml:space="preserve">Whether review can be enforced:  </w:t>
+      </w:r>
+      <w:r>
+        <w:rPr>
+          <w:color w:val="1A1A1A"/>
+          <w:sz w:val="21"/>
+        </w:rPr>
+        <w:t>the prototype refuses to produce a profile until a human has approved or excluded every indicator. The safeguard this document insisted on is enforced in software rather than left to discipline.</w:t>
+      </w:r>
+    </w:p>
+    <w:p>
+      <w:pPr>
+        <w:pStyle w:val="ListBullet"/>
+        <w:spacing w:after="80"/>
+        <w:ind w:left="340"/>
+      </w:pPr>
+      <w:r>
+        <w:rPr>
+          <w:b/>
+          <w:color w:val="1A1A1A"/>
+          <w:sz w:val="21"/>
+        </w:rPr>
+        <w:t xml:space="preserve">Whether provenance survives extraction:  </w:t>
+      </w:r>
+      <w:r>
+        <w:rPr>
+          <w:color w:val="1A1A1A"/>
+          <w:sz w:val="21"/>
+        </w:rPr>
+        <w:t>each extracted figure carries the page it came from, whether it was read from a table or from narrative text, and a confidence score. A reviewer can check a number without leaving the screen.</w:t>
+      </w:r>
+    </w:p>
+    <w:p>
+      <w:pPr>
+        <w:spacing w:after="160"/>
+      </w:pPr>
+      <w:r>
+        <w:rPr>
+          <w:b/>
+          <w:i w:val="0"/>
+          <w:color w:val="1A1A1A"/>
+          <w:sz w:val="21"/>
+        </w:rPr>
+        <w:t xml:space="preserve">What remains unanswered is the only question that matters commercially. </w:t>
+      </w:r>
+      <w:r>
+        <w:rPr>
+          <w:b w:val="0"/>
+          <w:i w:val="0"/>
+          <w:color w:val="1A1A1A"/>
+          <w:sz w:val="21"/>
+        </w:rPr>
+        <w:t>Nobody has run it against a report whose correct answers are known, so extraction accuracy is unmeasured. That number decides whether a client can review their own profile — which is what makes the volume economics work — or whether every profile must pass through the consultant, which caps the business at his available hours.</w:t>
+      </w:r>
+    </w:p>
+    <w:p>
+      <w:pPr>
+        <w:spacing w:after="200"/>
+      </w:pPr>
+      <w:r>
+        <w:rPr>
+          <w:i w:val="0"/>
+          <w:color w:val="1A1A1A"/>
+          <w:sz w:val="21"/>
+        </w:rPr>
+        <w:t>The measurement is now inexpensive. An analyst-curated profile already exists for a company whose report is public, giving several hundred known-correct rows to score against. This is a day of work, not the two-week exercise originally scoped.</w:t>
+      </w:r>
+    </w:p>
+    <w:p>
+      <w:pPr>
+        <w:keepNext/>
+        <w:spacing w:before="240" w:after="60"/>
+      </w:pPr>
+      <w:r>
+        <w:rPr>
+          <w:b/>
+          <w:color w:val="1A1A1A"/>
+          <w:sz w:val="23"/>
+        </w:rPr>
+        <w:t>From prototype to something saleable</w:t>
+      </w:r>
+    </w:p>
+    <w:p>
+      <w:pPr>
+        <w:spacing w:after="160"/>
+      </w:pPr>
+      <w:r>
+        <w:rPr>
+          <w:i w:val="0"/>
+          <w:color w:val="1A1A1A"/>
+          <w:sz w:val="21"/>
+        </w:rPr>
+        <w:t>The prototype works. What separates it from a product is a short, specific list, and none of it is a feature request.</w:t>
+      </w:r>
+    </w:p>
+    <w:tbl>
+      <w:tblPr>
+        <w:tblStyle w:val="TableGrid"/>
+        <w:tblW w:type="auto" w:w="0"/>
+        <w:jc w:val="center"/>
+        <w:tblLayout w:type="fixed"/>
+        <w:tblLook w:firstColumn="1" w:firstRow="1" w:lastColumn="0" w:lastRow="0" w:noHBand="0" w:noVBand="1" w:val="04A0"/>
+        <w:tblCellMar>
+          <w:top w:w="70" w:type="dxa"/>
+          <w:left w:w="110" w:type="dxa"/>
+          <w:bottom w:w="70" w:type="dxa"/>
+          <w:right w:w="110" w:type="dxa"/>
+        </w:tblCellMar>
+      </w:tblPr>
+      <w:tblGrid>
+        <w:gridCol w:w="4706"/>
+        <w:gridCol w:w="4706"/>
+      </w:tblGrid>
+      <w:tr>
+        <w:trPr>
+          <w:cantSplit/>
+          <w:tblHeader w:val="true"/>
+        </w:trPr>
+        <w:tc>
+          <w:tcPr>
+            <w:tcW w:type="dxa" w:w="2608"/>
+            <w:shd w:val="clear" w:color="auto" w:fill="0F4C5C"/>
+          </w:tcPr>
+          <w:p>
+            <w:pPr>
+              <w:spacing w:after="0" w:before="0"/>
+            </w:pPr>
+            <w:r/>
+            <w:r>
+              <w:rPr>
+                <w:b/>
+                <w:color w:val="FFFFFF"/>
+                <w:sz w:val="19"/>
+              </w:rPr>
+              <w:t>What</w:t>
+            </w:r>
+          </w:p>
+        </w:tc>
+        <w:tc>
+          <w:tcPr>
+            <w:tcW w:type="dxa" w:w="6803"/>
+            <w:shd w:val="clear" w:color="auto" w:fill="0F4C5C"/>
+          </w:tcPr>
+          <w:p>
+            <w:pPr>
+              <w:spacing w:after="0" w:before="0"/>
+            </w:pPr>
+            <w:r/>
+            <w:r>
+              <w:rPr>
+                <w:b/>
+                <w:color w:val="FFFFFF"/>
+                <w:sz w:val="19"/>
+              </w:rPr>
+              <w:t>Why it blocks a sale</w:t>
+            </w:r>
+          </w:p>
+        </w:tc>
+      </w:tr>
+      <w:tr>
+        <w:trPr>
+          <w:cantSplit/>
+        </w:trPr>
+        <w:tc>
+          <w:tcPr>
+            <w:tcW w:type="dxa" w:w="2608"/>
+          </w:tcPr>
+          <w:p>
+            <w:pPr>
+              <w:spacing w:after="0" w:before="0"/>
+            </w:pPr>
+            <w:r/>
+            <w:r>
+              <w:rPr>
+                <w:color w:val="1A1A1A"/>
+                <w:sz w:val="19"/>
+              </w:rPr>
+              <w:t>Accuracy is still unmeasured</w:t>
+            </w:r>
+          </w:p>
+        </w:tc>
+        <w:tc>
+          <w:tcPr>
+            <w:tcW w:type="dxa" w:w="6803"/>
+          </w:tcPr>
+          <w:p>
+            <w:pPr>
+              <w:spacing w:after="0" w:before="0"/>
+            </w:pPr>
+            <w:r/>
+            <w:r>
+              <w:rPr>
+                <w:color w:val="1A1A1A"/>
+                <w:sz w:val="19"/>
+              </w:rPr>
+              <w:t>It cannot be priced, promised, or used to decide whether a client reviews their own profile. And a defect found on 9 September shows the number may not be what intuition suggests: the extractor mis-locates two of the nine BRSR principles on the one test document available, reporting one principle's content under another's codes.</w:t>
+            </w:r>
+          </w:p>
+        </w:tc>
+      </w:tr>
+      <w:tr>
+        <w:trPr>
+          <w:cantSplit/>
+        </w:trPr>
+        <w:tc>
+          <w:tcPr>
+            <w:tcW w:type="dxa" w:w="2608"/>
+            <w:shd w:val="clear" w:color="auto" w:fill="F1F5F6"/>
+          </w:tcPr>
+          <w:p>
+            <w:pPr>
+              <w:spacing w:after="0" w:before="0"/>
+            </w:pPr>
+            <w:r/>
+            <w:r>
+              <w:rPr>
+                <w:color w:val="1A1A1A"/>
+                <w:sz w:val="19"/>
+              </w:rPr>
+              <w:t>The review gate can be bypassed</w:t>
+            </w:r>
+          </w:p>
+        </w:tc>
+        <w:tc>
+          <w:tcPr>
+            <w:tcW w:type="dxa" w:w="6803"/>
+            <w:shd w:val="clear" w:color="auto" w:fill="F1F5F6"/>
+          </w:tcPr>
+          <w:p>
+            <w:pPr>
+              <w:spacing w:after="0" w:before="0"/>
+            </w:pPr>
+            <w:r/>
+            <w:r>
+              <w:rPr>
+                <w:color w:val="1A1A1A"/>
+                <w:sz w:val="19"/>
+              </w:rPr>
+              <w:t>An “Approve all” control satisfies the gate for every indicator in one click. The gate is the property that makes this defensible; a single button makes it ceremonial.</w:t>
+            </w:r>
+          </w:p>
+        </w:tc>
+      </w:tr>
+      <w:tr>
+        <w:trPr>
+          <w:cantSplit/>
+        </w:trPr>
+        <w:tc>
+          <w:tcPr>
+            <w:tcW w:type="dxa" w:w="2608"/>
+          </w:tcPr>
+          <w:p>
+            <w:pPr>
+              <w:spacing w:after="0" w:before="0"/>
+            </w:pPr>
+            <w:r/>
+            <w:r>
+              <w:rPr>
+                <w:color w:val="1A1A1A"/>
+                <w:sz w:val="19"/>
+              </w:rPr>
+              <w:t>Review work is not saved</w:t>
+            </w:r>
+          </w:p>
+        </w:tc>
+        <w:tc>
+          <w:tcPr>
+            <w:tcW w:type="dxa" w:w="6803"/>
+          </w:tcPr>
+          <w:p>
+            <w:pPr>
+              <w:spacing w:after="0" w:before="0"/>
+            </w:pPr>
+            <w:r/>
+            <w:r>
+              <w:rPr>
+                <w:color w:val="1A1A1A"/>
+                <w:sz w:val="19"/>
+              </w:rPr>
+              <w:t>Roughly an hour of reviewing is lost to a reload or a closed tab. Tolerable in a prototype, not in something a client pays for.</w:t>
+            </w:r>
+          </w:p>
+        </w:tc>
+      </w:tr>
+      <w:tr>
+        <w:trPr>
+          <w:cantSplit/>
+        </w:trPr>
+        <w:tc>
+          <w:tcPr>
+            <w:tcW w:type="dxa" w:w="2608"/>
+            <w:shd w:val="clear" w:color="auto" w:fill="F1F5F6"/>
+          </w:tcPr>
+          <w:p>
+            <w:pPr>
+              <w:spacing w:after="0" w:before="0"/>
+            </w:pPr>
+            <w:r/>
+            <w:r>
+              <w:rPr>
+                <w:color w:val="1A1A1A"/>
+                <w:sz w:val="19"/>
+              </w:rPr>
+              <w:t>One report is not a sample</w:t>
+            </w:r>
+          </w:p>
+        </w:tc>
+        <w:tc>
+          <w:tcPr>
+            <w:tcW w:type="dxa" w:w="6803"/>
+            <w:shd w:val="clear" w:color="auto" w:fill="F1F5F6"/>
+          </w:tcPr>
+          <w:p>
+            <w:pPr>
+              <w:spacing w:after="0" w:before="0"/>
+            </w:pPr>
+            <w:r/>
+            <w:r>
+              <w:rPr>
+                <w:color w:val="1A1A1A"/>
+                <w:sz w:val="19"/>
+              </w:rPr>
+              <w:t>Layout varies between companies and is the largest remaining unknown. Three to five reports before any accuracy claim is made externally.</w:t>
+            </w:r>
+          </w:p>
+        </w:tc>
+      </w:tr>
+      <w:tr>
+        <w:trPr>
+          <w:cantSplit/>
+        </w:trPr>
+        <w:tc>
+          <w:tcPr>
+            <w:tcW w:type="dxa" w:w="2608"/>
+          </w:tcPr>
+          <w:p>
+            <w:pPr>
+              <w:spacing w:after="0" w:before="0"/>
+            </w:pPr>
+            <w:r/>
+            <w:r>
+              <w:rPr>
+                <w:color w:val="1A1A1A"/>
+                <w:sz w:val="19"/>
+              </w:rPr>
+              <w:t>No audit trail leaves the app</w:t>
+            </w:r>
+          </w:p>
+        </w:tc>
+        <w:tc>
+          <w:tcPr>
+            <w:tcW w:type="dxa" w:w="6803"/>
+          </w:tcPr>
+          <w:p>
+            <w:pPr>
+              <w:spacing w:after="0" w:before="0"/>
+            </w:pPr>
+            <w:r/>
+            <w:r>
+              <w:rPr>
+                <w:color w:val="1A1A1A"/>
+                <w:sz w:val="19"/>
+              </w:rPr>
+              <w:t>See below. This is the largest missed opportunity, and the cheapest to close.</w:t>
+            </w:r>
+          </w:p>
+        </w:tc>
+      </w:tr>
+    </w:tbl>
+    <w:p>
+      <w:pPr>
+        <w:spacing w:after="40"/>
+      </w:pPr>
+    </w:p>
+    <w:p>
+      <w:pPr>
+        <w:keepNext/>
+        <w:spacing w:before="240" w:after="60"/>
+      </w:pPr>
+      <w:r>
+        <w:rPr>
+          <w:b/>
+          <w:color w:val="1A1A1A"/>
+          <w:sz w:val="23"/>
+        </w:rPr>
+        <w:t>The audit trail is the saleable artefact</w:t>
+      </w:r>
+    </w:p>
+    <w:p>
+      <w:pPr>
+        <w:spacing w:after="160"/>
+      </w:pPr>
+      <w:r>
+        <w:rPr>
+          <w:b/>
+          <w:i w:val="0"/>
+          <w:color w:val="1A1A1A"/>
+          <w:sz w:val="21"/>
+        </w:rPr>
+        <w:t xml:space="preserve">For an investor relations team, the record of where each figure came from and who approved it is worth more than the profile page. </w:t>
+      </w:r>
+      <w:r>
+        <w:rPr>
+          <w:b w:val="0"/>
+          <w:i w:val="0"/>
+          <w:color w:val="1A1A1A"/>
+          <w:sz w:val="21"/>
+        </w:rPr>
+        <w:t>Every figure, the page it was read from, whether it came from a table or narrative text, the confidence, what the extractor originally produced, what a human corrected it to, and who approved it when. That file is the answer to “where did this number come from?”, and it turns the provenance argument from a claim into a document that can be handed to a client or an auditor.</w:t>
+      </w:r>
+    </w:p>
+    <w:p>
+      <w:pPr>
+        <w:spacing w:after="160"/>
+      </w:pPr>
+      <w:r>
+        <w:rPr>
+          <w:i w:val="0"/>
+          <w:color w:val="1A1A1A"/>
+          <w:sz w:val="21"/>
+        </w:rPr>
+        <w:t>It is also the cheapest item on the list. The data already exists inside the application; it simply never leaves.</w:t>
+      </w:r>
+    </w:p>
+    <w:p>
+      <w:pPr>
+        <w:spacing w:after="160"/>
+      </w:pPr>
+      <w:r>
+        <w:rPr>
+          <w:b/>
+          <w:i w:val="0"/>
+          <w:color w:val="1A1A1A"/>
+          <w:sz w:val="21"/>
+        </w:rPr>
+        <w:t xml:space="preserve">One consequence worth stating plainly: the defensible asset is not the extractor. </w:t>
+      </w:r>
+      <w:r>
+        <w:rPr>
+          <w:b w:val="0"/>
+          <w:i w:val="0"/>
+          <w:color w:val="1A1A1A"/>
+          <w:sz w:val="21"/>
+        </w:rPr>
+        <w:t>Reading a PDF is commodity work and will only get easier. What a competitor cannot assemble in a weekend is the accumulated mapping between BRSR indicators, GRI disclosures and IFC Performance Standards, each traceable to a named public document, together with the exclusions learned by seeing what the obvious approach produced. The audit trail is what makes that asset visible to a buyer.</w:t>
       </w:r>
     </w:p>
     <w:p>
@@ -4515,6 +5051,127 @@
                 <w:color w:val="1A1A1A"/>
                 <w:sz w:val="19"/>
               </w:rPr>
+              <w:t>Fix the extractor's section-locating defect. It mis-assigns two of nine BRSR principles, and the same fix is what reading full annual reports requires.</w:t>
+            </w:r>
+          </w:p>
+        </w:tc>
+        <w:tc>
+          <w:tcPr>
+            <w:tcW w:type="dxa" w:w="2608"/>
+          </w:tcPr>
+          <w:p>
+            <w:pPr>
+              <w:spacing w:after="0" w:before="0"/>
+            </w:pPr>
+            <w:r/>
+            <w:r>
+              <w:rPr>
+                <w:color w:val="1A1A1A"/>
+                <w:sz w:val="19"/>
+              </w:rPr>
+              <w:t>Before anything else in Phase 3</w:t>
+            </w:r>
+          </w:p>
+        </w:tc>
+      </w:tr>
+      <w:tr>
+        <w:trPr>
+          <w:cantSplit/>
+        </w:trPr>
+        <w:tc>
+          <w:tcPr>
+            <w:tcW w:type="dxa" w:w="567"/>
+            <w:shd w:val="clear" w:color="auto" w:fill="F1F5F6"/>
+          </w:tcPr>
+          <w:p>
+            <w:pPr>
+              <w:spacing w:after="0" w:before="0"/>
+            </w:pPr>
+            <w:r/>
+            <w:r>
+              <w:rPr>
+                <w:color w:val="1A1A1A"/>
+                <w:sz w:val="19"/>
+              </w:rPr>
+              <w:t>2</w:t>
+            </w:r>
+          </w:p>
+        </w:tc>
+        <w:tc>
+          <w:tcPr>
+            <w:tcW w:type="dxa" w:w="6236"/>
+            <w:shd w:val="clear" w:color="auto" w:fill="F1F5F6"/>
+          </w:tcPr>
+          <w:p>
+            <w:pPr>
+              <w:spacing w:after="0" w:before="0"/>
+            </w:pPr>
+            <w:r/>
+            <w:r>
+              <w:rPr>
+                <w:color w:val="1A1A1A"/>
+                <w:sz w:val="19"/>
+              </w:rPr>
+              <w:t>Measure extraction accuracy against a report with known-correct answers. Everything about Phase 3 economics, including who reviews, follows from this number - but it must come after the fix above, or the number will be wrong in a way nobody notices.</w:t>
+            </w:r>
+          </w:p>
+        </w:tc>
+        <w:tc>
+          <w:tcPr>
+            <w:tcW w:type="dxa" w:w="2608"/>
+            <w:shd w:val="clear" w:color="auto" w:fill="F1F5F6"/>
+          </w:tcPr>
+          <w:p>
+            <w:pPr>
+              <w:spacing w:after="0" w:before="0"/>
+            </w:pPr>
+            <w:r/>
+            <w:r>
+              <w:rPr>
+                <w:color w:val="1A1A1A"/>
+                <w:sz w:val="19"/>
+              </w:rPr>
+              <w:t>Immediately after the fix</w:t>
+            </w:r>
+          </w:p>
+        </w:tc>
+      </w:tr>
+      <w:tr>
+        <w:trPr>
+          <w:cantSplit/>
+        </w:trPr>
+        <w:tc>
+          <w:tcPr>
+            <w:tcW w:type="dxa" w:w="567"/>
+          </w:tcPr>
+          <w:p>
+            <w:pPr>
+              <w:spacing w:after="0" w:before="0"/>
+            </w:pPr>
+            <w:r/>
+            <w:r>
+              <w:rPr>
+                <w:color w:val="1A1A1A"/>
+                <w:sz w:val="19"/>
+              </w:rPr>
+              <w:t>3</w:t>
+            </w:r>
+          </w:p>
+        </w:tc>
+        <w:tc>
+          <w:tcPr>
+            <w:tcW w:type="dxa" w:w="6236"/>
+          </w:tcPr>
+          <w:p>
+            <w:pPr>
+              <w:spacing w:after="0" w:before="0"/>
+            </w:pPr>
+            <w:r/>
+            <w:r>
+              <w:rPr>
+                <w:color w:val="1A1A1A"/>
+                <w:sz w:val="19"/>
+              </w:rPr>
               <w:t>Sign off the Environmental / Social / Governance classification mapping. Rule-based classification covers about 84% of rows; 105 are genuinely none of the three. The filter is deliberately unbuilt until this is agreed, because any row's classification may have to be defended to a client.</w:t>
             </w:r>
           </w:p>
@@ -4557,7 +5214,7 @@
                 <w:color w:val="1A1A1A"/>
                 <w:sz w:val="19"/>
               </w:rPr>
-              <w:t>2</w:t>
+              <w:t>4</w:t>
             </w:r>
           </w:p>
         </w:tc>
@@ -4618,7 +5275,7 @@
                 <w:color w:val="1A1A1A"/>
                 <w:sz w:val="19"/>
               </w:rPr>
-              <w:t>3</w:t>
+              <w:t>5</w:t>
             </w:r>
           </w:p>
         </w:tc>
@@ -4678,7 +5335,7 @@
                 <w:color w:val="1A1A1A"/>
                 <w:sz w:val="19"/>
               </w:rPr>
-              <w:t>4</w:t>
+              <w:t>6</w:t>
             </w:r>
           </w:p>
         </w:tc>
@@ -4739,7 +5396,7 @@
                 <w:color w:val="1A1A1A"/>
                 <w:sz w:val="19"/>
               </w:rPr>
-              <w:t>5</w:t>
+              <w:t>7</w:t>
             </w:r>
           </w:p>
         </w:tc>
@@ -4799,7 +5456,7 @@
                 <w:color w:val="1A1A1A"/>
                 <w:sz w:val="19"/>
               </w:rPr>
-              <w:t>6</w:t>
+              <w:t>8</w:t>
             </w:r>
           </w:p>
         </w:tc>
@@ -4860,7 +5517,7 @@
                 <w:color w:val="1A1A1A"/>
                 <w:sz w:val="19"/>
               </w:rPr>
-              <w:t>7</w:t>
+              <w:t>9</w:t>
             </w:r>
           </w:p>
         </w:tc>
@@ -4920,7 +5577,7 @@
                 <w:color w:val="1A1A1A"/>
                 <w:sz w:val="19"/>
               </w:rPr>
-              <w:t>8</w:t>
+              <w:t>10</w:t>
             </w:r>
           </w:p>
         </w:tc>

</xml_diff>